<commit_message>
implement blockchain-based university voting system
</commit_message>
<xml_diff>
--- a/Documentation/Project_proposal.docx
+++ b/Documentation/Project_proposal.docx
@@ -1208,16 +1208,16 @@
         <mc:AlternateContent>
           <mc:Choice Requires="wps">
             <w:drawing>
-              <wp:anchor distT="0" distB="0" distL="114300" distR="114300" simplePos="0" relativeHeight="251665408" behindDoc="0" locked="0" layoutInCell="1" allowOverlap="1" wp14:anchorId="3DF9384E" wp14:editId="317EB852">
+              <wp:anchor distT="0" distB="0" distL="114300" distR="114300" simplePos="0" relativeHeight="251665408" behindDoc="0" locked="0" layoutInCell="1" allowOverlap="1" wp14:anchorId="3DF9384E" wp14:editId="7A03C438">
                 <wp:simplePos x="0" y="0"/>
                 <wp:positionH relativeFrom="margin">
                   <wp:posOffset>-15240</wp:posOffset>
                 </wp:positionH>
                 <wp:positionV relativeFrom="paragraph">
-                  <wp:posOffset>741045</wp:posOffset>
+                  <wp:posOffset>634365</wp:posOffset>
                 </wp:positionV>
-                <wp:extent cx="5419725" cy="2926080"/>
-                <wp:effectExtent l="0" t="0" r="0" b="7620"/>
+                <wp:extent cx="5419725" cy="3032760"/>
+                <wp:effectExtent l="0" t="0" r="0" b="0"/>
                 <wp:wrapNone/>
                 <wp:docPr id="9" name="Text Box 9"/>
                 <wp:cNvGraphicFramePr/>
@@ -1228,7 +1228,7 @@
                       <wps:spPr>
                         <a:xfrm>
                           <a:off x="0" y="0"/>
-                          <a:ext cx="5419725" cy="2926080"/>
+                          <a:ext cx="5419725" cy="3032760"/>
                         </a:xfrm>
                         <a:prstGeom prst="rect">
                           <a:avLst/>
@@ -1368,6 +1368,66 @@
                                 <w:lang w:val="en-US"/>
                               </w:rPr>
                               <w:t xml:space="preserve"> (54482)</w:t>
+                            </w:r>
+                          </w:p>
+                          <w:p>
+                            <w:pPr>
+                              <w:pStyle w:val="ListParagraph"/>
+                              <w:numPr>
+                                <w:ilvl w:val="0"/>
+                                <w:numId w:val="1"/>
+                              </w:numPr>
+                              <w:rPr>
+                                <w:rFonts w:ascii="Calibri" w:hAnsi="Calibri" w:cs="Calibri"/>
+                                <w:color w:val="333333"/>
+                                <w:sz w:val="40"/>
+                                <w:szCs w:val="40"/>
+                                <w:lang w:val="en-US"/>
+                              </w:rPr>
+                            </w:pPr>
+                            <w:proofErr w:type="spellStart"/>
+                            <w:r>
+                              <w:rPr>
+                                <w:rFonts w:ascii="Calibri" w:hAnsi="Calibri" w:cs="Calibri"/>
+                                <w:color w:val="333333"/>
+                                <w:sz w:val="40"/>
+                                <w:szCs w:val="40"/>
+                                <w:lang w:val="en-US"/>
+                              </w:rPr>
+                              <w:t>Nouman</w:t>
+                            </w:r>
+                            <w:proofErr w:type="spellEnd"/>
+                            <w:r>
+                              <w:rPr>
+                                <w:rFonts w:ascii="Calibri" w:hAnsi="Calibri" w:cs="Calibri"/>
+                                <w:color w:val="333333"/>
+                                <w:sz w:val="40"/>
+                                <w:szCs w:val="40"/>
+                                <w:lang w:val="en-US"/>
+                              </w:rPr>
+                              <w:t xml:space="preserve"> </w:t>
+                            </w:r>
+                            <w:proofErr w:type="spellStart"/>
+                            <w:r>
+                              <w:rPr>
+                                <w:rFonts w:ascii="Calibri" w:hAnsi="Calibri" w:cs="Calibri"/>
+                                <w:color w:val="333333"/>
+                                <w:sz w:val="40"/>
+                                <w:szCs w:val="40"/>
+                                <w:lang w:val="en-US"/>
+                              </w:rPr>
+                              <w:t>Mohsin</w:t>
+                            </w:r>
+                            <w:proofErr w:type="spellEnd"/>
+                            <w:r>
+                              <w:rPr>
+                                <w:rFonts w:ascii="Calibri" w:hAnsi="Calibri" w:cs="Calibri"/>
+                                <w:color w:val="333333"/>
+                                <w:sz w:val="40"/>
+                                <w:szCs w:val="40"/>
+                                <w:lang w:val="en-US"/>
+                              </w:rPr>
+                              <w:t xml:space="preserve"> (52963)</w:t>
                             </w:r>
                           </w:p>
                           <w:p>
@@ -1570,7 +1630,11 @@
           </mc:Choice>
           <mc:Fallback>
             <w:pict>
-              <v:shape w14:anchorId="3DF9384E" id="Text Box 9" o:spid="_x0000_s1029" type="#_x0000_t202" style="position:absolute;left:0;text-align:left;margin-left:-1.2pt;margin-top:58.35pt;width:426.75pt;height:230.4pt;z-index:251665408;visibility:visible;mso-wrap-style:square;mso-width-percent:0;mso-height-percent:0;mso-wrap-distance-left:9pt;mso-wrap-distance-top:0;mso-wrap-distance-right:9pt;mso-wrap-distance-bottom:0;mso-position-horizontal:absolute;mso-position-horizontal-relative:margin;mso-position-vertical:absolute;mso-position-vertical-relative:text;mso-width-percent:0;mso-height-percent:0;mso-width-relative:margin;mso-height-relative:margin;v-text-anchor:top" o:gfxdata="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" filled="f" stroked="f" strokeweight=".5pt">
+              <v:shapetype w14:anchorId="3DF9384E" id="_x0000_t202" coordsize="21600,21600" o:spt="202" path="m,l,21600r21600,l21600,xe">
+                <v:stroke joinstyle="miter"/>
+                <v:path gradientshapeok="t" o:connecttype="rect"/>
+              </v:shapetype>
+              <v:shape id="Text Box 9" o:spid="_x0000_s1029" type="#_x0000_t202" style="position:absolute;left:0;text-align:left;margin-left:-1.2pt;margin-top:49.95pt;width:426.75pt;height:238.8pt;z-index:251665408;visibility:visible;mso-wrap-style:square;mso-width-percent:0;mso-height-percent:0;mso-wrap-distance-left:9pt;mso-wrap-distance-top:0;mso-wrap-distance-right:9pt;mso-wrap-distance-bottom:0;mso-position-horizontal:absolute;mso-position-horizontal-relative:margin;mso-position-vertical:absolute;mso-position-vertical-relative:text;mso-width-percent:0;mso-height-percent:0;mso-width-relative:margin;mso-height-relative:margin;v-text-anchor:top" o:gfxdata="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" filled="f" stroked="f" strokeweight=".5pt">
                 <v:textbox>
                   <w:txbxContent>
                     <w:p>
@@ -1686,6 +1750,66 @@
                           <w:lang w:val="en-US"/>
                         </w:rPr>
                         <w:t xml:space="preserve"> (54482)</w:t>
+                      </w:r>
+                    </w:p>
+                    <w:p>
+                      <w:pPr>
+                        <w:pStyle w:val="ListParagraph"/>
+                        <w:numPr>
+                          <w:ilvl w:val="0"/>
+                          <w:numId w:val="1"/>
+                        </w:numPr>
+                        <w:rPr>
+                          <w:rFonts w:ascii="Calibri" w:hAnsi="Calibri" w:cs="Calibri"/>
+                          <w:color w:val="333333"/>
+                          <w:sz w:val="40"/>
+                          <w:szCs w:val="40"/>
+                          <w:lang w:val="en-US"/>
+                        </w:rPr>
+                      </w:pPr>
+                      <w:proofErr w:type="spellStart"/>
+                      <w:r>
+                        <w:rPr>
+                          <w:rFonts w:ascii="Calibri" w:hAnsi="Calibri" w:cs="Calibri"/>
+                          <w:color w:val="333333"/>
+                          <w:sz w:val="40"/>
+                          <w:szCs w:val="40"/>
+                          <w:lang w:val="en-US"/>
+                        </w:rPr>
+                        <w:t>Nouman</w:t>
+                      </w:r>
+                      <w:proofErr w:type="spellEnd"/>
+                      <w:r>
+                        <w:rPr>
+                          <w:rFonts w:ascii="Calibri" w:hAnsi="Calibri" w:cs="Calibri"/>
+                          <w:color w:val="333333"/>
+                          <w:sz w:val="40"/>
+                          <w:szCs w:val="40"/>
+                          <w:lang w:val="en-US"/>
+                        </w:rPr>
+                        <w:t xml:space="preserve"> </w:t>
+                      </w:r>
+                      <w:proofErr w:type="spellStart"/>
+                      <w:r>
+                        <w:rPr>
+                          <w:rFonts w:ascii="Calibri" w:hAnsi="Calibri" w:cs="Calibri"/>
+                          <w:color w:val="333333"/>
+                          <w:sz w:val="40"/>
+                          <w:szCs w:val="40"/>
+                          <w:lang w:val="en-US"/>
+                        </w:rPr>
+                        <w:t>Mohsin</w:t>
+                      </w:r>
+                      <w:proofErr w:type="spellEnd"/>
+                      <w:r>
+                        <w:rPr>
+                          <w:rFonts w:ascii="Calibri" w:hAnsi="Calibri" w:cs="Calibri"/>
+                          <w:color w:val="333333"/>
+                          <w:sz w:val="40"/>
+                          <w:szCs w:val="40"/>
+                          <w:lang w:val="en-US"/>
+                        </w:rPr>
+                        <w:t xml:space="preserve"> (52963)</w:t>
                       </w:r>
                     </w:p>
                     <w:p>
@@ -2342,23 +2466,13 @@
           <w:szCs w:val="28"/>
         </w:rPr>
       </w:pPr>
-      <w:proofErr w:type="spellStart"/>
-      <w:r>
-        <w:rPr>
-          <w:rFonts w:ascii="Times New Roman" w:hAnsi="Times New Roman" w:cs="Times New Roman"/>
-          <w:sz w:val="28"/>
-          <w:szCs w:val="28"/>
-        </w:rPr>
-        <w:t>Ethereum</w:t>
-      </w:r>
-      <w:proofErr w:type="spellEnd"/>
-      <w:r>
-        <w:rPr>
-          <w:rFonts w:ascii="Times New Roman" w:hAnsi="Times New Roman" w:cs="Times New Roman"/>
-          <w:sz w:val="28"/>
-          <w:szCs w:val="28"/>
-        </w:rPr>
-        <w:t xml:space="preserve"> </w:t>
+      <w:r>
+        <w:rPr>
+          <w:rFonts w:ascii="Times New Roman" w:hAnsi="Times New Roman" w:cs="Times New Roman"/>
+          <w:sz w:val="28"/>
+          <w:szCs w:val="28"/>
+        </w:rPr>
+        <w:t xml:space="preserve">Ethereum </w:t>
       </w:r>
       <w:r>
         <w:rPr>
@@ -2721,7 +2835,7 @@
           <w:rPr>
             <w:noProof/>
           </w:rPr>
-          <w:t>2</w:t>
+          <w:t>3</w:t>
         </w:r>
         <w:r>
           <w:rPr>
@@ -5244,7 +5358,7 @@
 </file>
 
 <file path=customXml/itemProps1.xml><?xml version="1.0" encoding="utf-8"?>
-<ds:datastoreItem xmlns:ds="http://schemas.openxmlformats.org/officeDocument/2006/customXml" ds:itemID="{ACEE2870-65B0-4E48-8C9B-3E476428C996}">
+<ds:datastoreItem xmlns:ds="http://schemas.openxmlformats.org/officeDocument/2006/customXml" ds:itemID="{BA09931A-0E24-49B3-8A37-36933B6B0943}">
   <ds:schemaRefs>
     <ds:schemaRef ds:uri="http://schemas.openxmlformats.org/officeDocument/2006/bibliography"/>
   </ds:schemaRefs>

</xml_diff>